<commit_message>
feat: Política de Controle Tecnológico R03 aprovada (status AP, 21/10/2026)
Aprovação pelo Gerente de Engenharia e Qualidade; revisão e data mantidas. Área de elaboração passa a Coordenação de Pavimento e Monitoração. Mesmo conteúdo técnico da R03.

Co-Authored-By: Claude Fable 5.1 <noreply@anthropic.com>
</commit_message>
<xml_diff>
--- a/politica-controle-tecnologico/arquivos/Anexo_1_Amostragem_Guarda_Amostras_R02.docx
+++ b/politica-controle-tecnologico/arquivos/Anexo_1_Amostragem_Guarda_Amostras_R02.docx
@@ -32,7 +32,7 @@
           <w:color w:val="617177"/>
           <w:sz w:val="21"/>
         </w:rPr>
-        <w:t>Código POL-CT-116-A1 · Revisão R02 · 21/10/2026 · Status PR</w:t>
+        <w:t>Código POL-CT-116-A1 · Revisão R02 · 21/10/2026 · Status AP</w:t>
       </w:r>
     </w:p>
     <w:tbl>
@@ -170,7 +170,7 @@
               <w:rPr>
                 <w:sz w:val="19"/>
               </w:rPr>
-              <w:t>PR</w:t>
+              <w:t>AP</w:t>
             </w:r>
           </w:p>
         </w:tc>
@@ -262,7 +262,7 @@
               <w:rPr>
                 <w:sz w:val="19"/>
               </w:rPr>
-              <w:t>Coordenação de Pavimento e Controle Tecnológico</w:t>
+              <w:t>Coordenação de Pavimento e Monitoração</w:t>
             </w:r>
             <w:r>
               <w:br/>
@@ -271,7 +271,7 @@
               <w:rPr>
                 <w:sz w:val="19"/>
               </w:rPr>
-              <w:t>Assinatura/data: [a assinar na emissão]</w:t>
+              <w:t>Assinatura/data: aprovado em 21/10/2026</w:t>
             </w:r>
           </w:p>
         </w:tc>
@@ -296,7 +296,7 @@
               <w:rPr>
                 <w:sz w:val="19"/>
               </w:rPr>
-              <w:t>Assinatura/data: [a assinar na emissão]</w:t>
+              <w:t>Assinatura/data: aprovado em 21/10/2026</w:t>
             </w:r>
           </w:p>
         </w:tc>
@@ -1724,7 +1724,7 @@
         <w:spacing w:after="120"/>
       </w:pPr>
       <w:r>
-        <w:t>Os pontos de verificação independente são escolhidos pela Coordenação de Pavimento e Controle Tecnológico ou pela Fiscalização, não pela EXECUTORA, e comunicados ao laboratório contratado na OS. A seleção usa sorteio ou malha sistemática com origem aleatória, registrada no PCT. A EXECUTORA é avisada da coleta com a antecedência do ponto W (24 horas) e pode acompanhá-la; a ausência não impede a coleta.</w:t>
+        <w:t>Os pontos de verificação independente são escolhidos pela Coordenação de Pavimento e Monitoração ou pela Fiscalização, não pela EXECUTORA, e comunicados ao laboratório contratado na OS. A seleção usa sorteio ou malha sistemática com origem aleatória, registrada no PCT. A EXECUTORA é avisada da coleta com a antecedência do ponto W (24 horas) e pode acompanhá-la; a ausência não impede a coleta.</w:t>
       </w:r>
     </w:p>
     <w:p>
@@ -2675,7 +2675,7 @@
         <w:noProof/>
       </w:rPr>
       <w:drawing>
-        <wp:inline distT="0" distB="0" distL="0" distR="0" wp14:anchorId="4F2175E3" wp14:editId="51B4606D">
+        <wp:inline distT="0" distB="0" distL="0" distR="0" wp14:anchorId="56B6C808" wp14:editId="3D24B6B2">
           <wp:extent cx="1872000" cy="501930"/>
           <wp:effectExtent l="0" t="0" r="0" b="0"/>
           <wp:docPr id="1" name="Picture 1"/>
@@ -2887,31 +2887,31 @@
       </w:rPr>
     </w:lvl>
   </w:abstractNum>
-  <w:num w:numId="1" w16cid:durableId="1244681133">
+  <w:num w:numId="1" w16cid:durableId="1266302906">
     <w:abstractNumId w:val="8"/>
   </w:num>
-  <w:num w:numId="2" w16cid:durableId="428475541">
+  <w:num w:numId="2" w16cid:durableId="1213347710">
     <w:abstractNumId w:val="6"/>
   </w:num>
-  <w:num w:numId="3" w16cid:durableId="1582369571">
+  <w:num w:numId="3" w16cid:durableId="505243064">
     <w:abstractNumId w:val="5"/>
   </w:num>
-  <w:num w:numId="4" w16cid:durableId="570039064">
+  <w:num w:numId="4" w16cid:durableId="1364401083">
     <w:abstractNumId w:val="4"/>
   </w:num>
-  <w:num w:numId="5" w16cid:durableId="2011449378">
+  <w:num w:numId="5" w16cid:durableId="1183594281">
     <w:abstractNumId w:val="7"/>
   </w:num>
-  <w:num w:numId="6" w16cid:durableId="21782812">
+  <w:num w:numId="6" w16cid:durableId="2054884788">
     <w:abstractNumId w:val="3"/>
   </w:num>
-  <w:num w:numId="7" w16cid:durableId="451482154">
+  <w:num w:numId="7" w16cid:durableId="1418015583">
     <w:abstractNumId w:val="2"/>
   </w:num>
-  <w:num w:numId="8" w16cid:durableId="1998999467">
+  <w:num w:numId="8" w16cid:durableId="698821067">
     <w:abstractNumId w:val="1"/>
   </w:num>
-  <w:num w:numId="9" w16cid:durableId="566645739">
+  <w:num w:numId="9" w16cid:durableId="1951741731">
     <w:abstractNumId w:val="0"/>
   </w:num>
 </w:numbering>

</xml_diff>